<commit_message>
Aggiunto il link della repository sulla tesina
</commit_message>
<xml_diff>
--- a/Tesina esame finale REST API e C#.docx
+++ b/Tesina esame finale REST API e C#.docx
@@ -3811,17 +3811,8 @@
           <w:sz w:val="28"/>
           <w:szCs w:val="28"/>
         </w:rPr>
-        <w:t xml:space="preserve"> disponibili (nel caso del mio esame pratico: /raccolta, /raccolta{id}, /raccolta/libri</w:t>
-      </w:r>
-      <w:proofErr w:type="gramStart"/>
-      <w:r>
-        <w:rPr>
-          <w:sz w:val="28"/>
-          <w:szCs w:val="28"/>
-        </w:rPr>
-        <w:t>),i</w:t>
-      </w:r>
-      <w:proofErr w:type="gramEnd"/>
+        <w:t xml:space="preserve"> disponibili (nel caso del mio esame pratico: /raccolta, /raccolta{id}, /raccolta/libri),i</w:t>
+      </w:r>
       <w:r>
         <w:rPr>
           <w:sz w:val="28"/>
@@ -4658,6 +4649,7 @@
       </w:pPr>
       <w:r>
         <w:rPr>
+          <w:noProof/>
           <w:sz w:val="28"/>
           <w:szCs w:val="28"/>
         </w:rPr>
@@ -4761,6 +4753,7 @@
       </w:pPr>
       <w:r>
         <w:rPr>
+          <w:noProof/>
           <w:sz w:val="28"/>
           <w:szCs w:val="28"/>
         </w:rPr>
@@ -4851,6 +4844,7 @@
       </w:pPr>
       <w:r>
         <w:rPr>
+          <w:noProof/>
           <w:sz w:val="28"/>
           <w:szCs w:val="28"/>
         </w:rPr>
@@ -4999,6 +4993,7 @@
       </w:pPr>
       <w:r>
         <w:rPr>
+          <w:noProof/>
           <w:sz w:val="28"/>
           <w:szCs w:val="28"/>
         </w:rPr>
@@ -5081,7 +5076,39 @@
     <w:p>
       <w:pPr>
         <w:pStyle w:val="NormaleWeb"/>
-        <w:jc w:val="both"/>
+        <w:rPr>
+          <w:sz w:val="28"/>
+          <w:szCs w:val="28"/>
+        </w:rPr>
+      </w:pPr>
+      <w:r>
+        <w:rPr>
+          <w:sz w:val="28"/>
+          <w:szCs w:val="28"/>
+        </w:rPr>
+        <w:t>Link del repository di GitHub:</w:t>
+      </w:r>
+      <w:r>
+        <w:rPr>
+          <w:sz w:val="28"/>
+          <w:szCs w:val="28"/>
+        </w:rPr>
+        <w:t xml:space="preserve"> </w:t>
+      </w:r>
+      <w:hyperlink r:id="rId9" w:history="1">
+        <w:r>
+          <w:rPr>
+            <w:rStyle w:val="Collegamentoipertestuale"/>
+            <w:sz w:val="28"/>
+            <w:szCs w:val="28"/>
+          </w:rPr>
+          <w:t>https://github.com/AleP033/EsameFinale_minimalAPI_C-_.NET.git</w:t>
+        </w:r>
+      </w:hyperlink>
+    </w:p>
+    <w:p>
+      <w:pPr>
+        <w:pStyle w:val="NormaleWeb"/>
         <w:rPr>
           <w:b/>
           <w:bCs/>
@@ -6173,7 +6200,6 @@
     <w:name w:val="Hyperlink"/>
     <w:basedOn w:val="Carpredefinitoparagrafo"/>
     <w:uiPriority w:val="99"/>
-    <w:semiHidden/>
     <w:unhideWhenUsed/>
     <w:rsid w:val="006C13A1"/>
     <w:rPr>
@@ -6305,6 +6331,18 @@
       <w:rFonts w:ascii="Courier New" w:eastAsia="Times New Roman" w:hAnsi="Courier New" w:cs="Courier New"/>
       <w:sz w:val="20"/>
       <w:szCs w:val="20"/>
+    </w:rPr>
+  </w:style>
+  <w:style w:type="character" w:styleId="Menzionenonrisolta">
+    <w:name w:val="Unresolved Mention"/>
+    <w:basedOn w:val="Carpredefinitoparagrafo"/>
+    <w:uiPriority w:val="99"/>
+    <w:semiHidden/>
+    <w:unhideWhenUsed/>
+    <w:rsid w:val="007034A0"/>
+    <w:rPr>
+      <w:color w:val="605E5C"/>
+      <w:shd w:val="clear" w:color="auto" w:fill="E1DFDD"/>
     </w:rPr>
   </w:style>
 </w:styles>

</xml_diff>